<commit_message>
Revise August report writing style
</commit_message>
<xml_diff>
--- a/reports/2026-08/제18대_학술소모임_8월_2차시_보고서_lawDing.docx
+++ b/reports/2026-08/제18대_학술소모임_8월_2차시_보고서_lawDing.docx
@@ -243,20 +243,7 @@
                 <w:b/>
                 <w:sz w:val="18"/>
               </w:rPr>
-              <w:t>LLM Wiki 사례 확장 자료 공유 및 개별 검토</w:t>
-            </w:r>
-          </w:p>
-          <w:p>
-            <w:pPr>
-              <w:spacing w:after="0"/>
-              <w:jc w:val="left"/>
-            </w:pPr>
-            <w:r>
-              <w:rPr>
-                <w:b w:val="0"/>
-                <w:sz w:val="18"/>
-              </w:rPr>
-              <w:t>별도 회의 대신, 소액 사기 사례를 LLM과 에이전트가 활용하기 쉬운 형태로 정리한 기술 보고서를 단체 채팅방에 공유하고 각자 내용을 검토하였다. 보고서에서는 LLM Wiki를 세계적으로 통일된 표준 용어로 단정하지 않고, 이 프로젝트에서 사용하는 ‘출처 링크가 붙은 선별 Markdown 지식 모음’이라는 의미로 설명하였다.</w:t>
+              <w:t>소액 사기 사례 위키 및 인공지능 활용</w:t>
             </w:r>
           </w:p>
           <w:p>
@@ -269,33 +256,59 @@
                 <w:b/>
                 <w:sz w:val="18"/>
               </w:rPr>
-              <w:t>사례 40건의 분류와 확인 범위</w:t>
-            </w:r>
-          </w:p>
-          <w:p>
-            <w:pPr>
-              <w:spacing w:after="0"/>
-              <w:jc w:val="left"/>
-            </w:pPr>
-            <w:r>
-              <w:rPr>
-                <w:b w:val="0"/>
-                <w:sz w:val="18"/>
-              </w:rPr>
-              <w:t>수집된 사례는 판결·법리·보도 자료를 중심으로 한 P 사례와 신고·수사·기소 등 절차 흐름을 중심으로 한 R 사례로 나누었다. 기존에 모은 P1~P10, R1~R10은 보도나 개인 경험, 검증 전 맥락이 포함된 자료이므로 공식 판결이나 실제 회수 결과로 읽지 않도록 상태를 표시하였다. 추가된 P11~P20은 공식 법원 판결을, R11~R20은 공식 검찰 기소 자료를 중심으로 정리하여 자료의 성격과 근거 수준을 구분하였다.</w:t>
-            </w:r>
-          </w:p>
-          <w:p>
-            <w:pPr>
-              <w:spacing w:after="0"/>
-              <w:jc w:val="left"/>
-            </w:pPr>
-            <w:r>
-              <w:rPr>
-                <w:b w:val="0"/>
-                <w:sz w:val="18"/>
-              </w:rPr>
-              <w:t>같은 사건이라도 신고, 기소, 판결, 송달, 확정, 집행, 실제 입금은 서로 다른 상태이므로 하나의 결과로 합쳐 표현하지 않는 것이 중요하다. 개인 경험은 절차를 이해하는 참고 자료로 활용할 수 있지만 일반적인 결과를 보장하는 근거로 사용해서는 안 되며, 공식 원문이 확인된 자료와 구별해 표시해야 한다.</w:t>
+              <w:t>1. 사례를 모은 이유 (김채은)</w:t>
+            </w:r>
+          </w:p>
+          <w:p>
+            <w:pPr>
+              <w:spacing w:after="0"/>
+              <w:jc w:val="left"/>
+            </w:pPr>
+            <w:r>
+              <w:rPr>
+                <w:b w:val="0"/>
+                <w:sz w:val="18"/>
+              </w:rPr>
+              <w:t>중고거래, 공동구매, 게임 계정, 상품권 등 소액 사기 수법이 다양하여 한두 사례만으로는 전체 흐름을 설명하기 어려움</w:t>
+            </w:r>
+          </w:p>
+          <w:p>
+            <w:pPr>
+              <w:spacing w:after="0"/>
+              <w:jc w:val="left"/>
+            </w:pPr>
+            <w:r>
+              <w:rPr>
+                <w:b w:val="0"/>
+                <w:sz w:val="18"/>
+              </w:rPr>
+              <w:t>같은 사기라도 신고만 한 사건, 재판까지 간 사건, 민사 소송으로 넘어간 사건 등 진행 과정이 서로 다름</w:t>
+            </w:r>
+          </w:p>
+          <w:p>
+            <w:pPr>
+              <w:spacing w:after="0"/>
+              <w:jc w:val="left"/>
+            </w:pPr>
+            <w:r>
+              <w:rPr>
+                <w:b w:val="0"/>
+                <w:sz w:val="18"/>
+              </w:rPr>
+              <w:t>피해자가 자신의 상황과 비슷한 사례를 보고 필요한 증거와 다음 절차를 이해할 수 있도록 사례 40건을 모음</w:t>
+            </w:r>
+          </w:p>
+          <w:p>
+            <w:pPr>
+              <w:spacing w:after="0"/>
+              <w:jc w:val="left"/>
+            </w:pPr>
+            <w:r>
+              <w:rPr>
+                <w:b w:val="0"/>
+                <w:sz w:val="18"/>
+              </w:rPr>
+              <w:t>처벌 결과만 모으는 것이 아니라 신고, 수사, 배상명령, 민사 소송, 실제 돈을 돌려받은 단계까지 같이 확인</w:t>
             </w:r>
           </w:p>
           <w:p>
@@ -308,33 +321,72 @@
                 <w:b/>
                 <w:sz w:val="18"/>
               </w:rPr>
-              <w:t>사례를 Wiki로 정리하는 방식</w:t>
-            </w:r>
-          </w:p>
-          <w:p>
-            <w:pPr>
-              <w:spacing w:after="0"/>
-              <w:jc w:val="left"/>
-            </w:pPr>
-            <w:r>
-              <w:rPr>
-                <w:b w:val="0"/>
-                <w:sz w:val="18"/>
-              </w:rPr>
-              <w:t>각 사례는 고정된 ID를 가진 별도의 Markdown 문서로 만들고, 출처, 사건의 핵심 사실, 절차 상태, 확인된 주장과 아직 확인되지 않은 내용을 함께 기록한다. 전체 사례 목록과 개별 문서를 연결하고, 레저와 해시를 통해 공개 파일의 변경 여부와 인용 관계를 남기며, 정해진 형식이 지켜졌는지 QA로 검사하는 구조를 사용하였다.</w:t>
-            </w:r>
-          </w:p>
-          <w:p>
-            <w:pPr>
-              <w:spacing w:after="0"/>
-              <w:jc w:val="left"/>
-            </w:pPr>
-            <w:r>
-              <w:rPr>
-                <w:b w:val="0"/>
-                <w:sz w:val="18"/>
-              </w:rPr>
-              <w:t>이러한 방식은 긴 원문 전체를 매번 AI에 넣는 대신 질문과 관련된 사례만 찾아 제공할 수 있어 문맥 낭비를 줄이고, 잘못된 내용이 발견되었을 때 해당 사례와 연결된 기록을 추적하여 수정하기 쉽다는 장점이 있다. 또한 사례의 근거 수준을 함께 전달함으로써 AI가 보도 내용이나 개인 경험을 확정된 법률 사실처럼 답변하는 위험을 줄일 수 있다.</w:t>
+              <w:t>2. 사례 자료 정리 방식 (김민규)</w:t>
+            </w:r>
+          </w:p>
+          <w:p>
+            <w:pPr>
+              <w:spacing w:after="0"/>
+              <w:jc w:val="left"/>
+            </w:pPr>
+            <w:r>
+              <w:rPr>
+                <w:b w:val="0"/>
+                <w:sz w:val="18"/>
+              </w:rPr>
+              <w:t>판결과 법리 중심 사례 / 신고와 수사 과정 중심 사례로 크게 나누어 정리</w:t>
+            </w:r>
+          </w:p>
+          <w:p>
+            <w:pPr>
+              <w:spacing w:after="0"/>
+              <w:jc w:val="left"/>
+            </w:pPr>
+            <w:r>
+              <w:rPr>
+                <w:b w:val="0"/>
+                <w:sz w:val="18"/>
+              </w:rPr>
+              <w:t>사례마다 번호를 붙이고 사건 내용, 사기 방식, 진행 과정, 참고 링크를 한 페이지에 정리</w:t>
+            </w:r>
+          </w:p>
+          <w:p>
+            <w:pPr>
+              <w:spacing w:after="0"/>
+              <w:jc w:val="left"/>
+            </w:pPr>
+            <w:r>
+              <w:rPr>
+                <w:b w:val="0"/>
+                <w:sz w:val="18"/>
+              </w:rPr>
+              <w:t>전체 사례 목록에서 각 문서로 바로 넘어갈 수 있게 연결 -&gt; 새로운 사례가 생기면 같은 형식으로 계속 추가</w:t>
+            </w:r>
+          </w:p>
+          <w:p>
+            <w:pPr>
+              <w:spacing w:after="0"/>
+              <w:jc w:val="left"/>
+            </w:pPr>
+            <w:r>
+              <w:rPr>
+                <w:b w:val="0"/>
+                <w:sz w:val="18"/>
+              </w:rPr>
+              <w:t>원본 자료는 그대로 보관하고, 인공지능이 읽을 자료는 짧고 일정한 글 형식으로 따로 정리</w:t>
+            </w:r>
+          </w:p>
+          <w:p>
+            <w:pPr>
+              <w:spacing w:after="0"/>
+              <w:jc w:val="left"/>
+            </w:pPr>
+            <w:r>
+              <w:rPr>
+                <w:b w:val="0"/>
+                <w:sz w:val="18"/>
+              </w:rPr>
+              <w:t>긴 원문 전체를 매번 넣지 않고 질문과 관련된 사례만 골라서 보여줄 수 있어 비용과 시간을 줄일 수 있음</w:t>
             </w:r>
           </w:p>
           <w:p>
@@ -347,33 +399,72 @@
                 <w:b/>
                 <w:sz w:val="18"/>
               </w:rPr>
-              <w:t>현재 구현된 기능과 한계</w:t>
-            </w:r>
-          </w:p>
-          <w:p>
-            <w:pPr>
-              <w:spacing w:after="0"/>
-              <w:jc w:val="left"/>
-            </w:pPr>
-            <w:r>
-              <w:rPr>
-                <w:b w:val="0"/>
-                <w:sz w:val="18"/>
-              </w:rPr>
-              <w:t>현재 프로젝트에는 로컬 사건 생성, 가려진 사건 요약 조회, 증거 추가를 위한 MCP 도구와 PDF·Markdown 자료를 초안 작업 공간으로 옮기는 Wiki intake 흐름이 구현되어 있다. 사건 요약은 개인정보가 그대로 외부 모델에 전달되지 않도록 가린 형태로 제공하며, 원본과 식별정보는 가능한 한 로컬에 두는 방향을 취한다.</w:t>
-            </w:r>
-          </w:p>
-          <w:p>
-            <w:pPr>
-              <w:spacing w:after="0"/>
-              <w:jc w:val="left"/>
-            </w:pPr>
-            <w:r>
-              <w:rPr>
-                <w:b w:val="0"/>
-                <w:sz w:val="18"/>
-              </w:rPr>
-              <w:t>반면 Wiki를 자동으로 검색하는 MCP 도구, 의미가 비슷한 문서를 찾는 검색, 사용자의 사건과 Wiki 주장을 자동으로 연결하는 기능은 아직 구현되지 않았다. URL을 입력해도 현재는 주소와 메타데이터만 기록할 뿐 원격 내용을 자동 수집하지 않으며, 생성된 초안은 원문 대조와 검증을 거쳐야 공개 사례가 된다. 신고·소송의 자동 제출, 결제, 법적 결정 역시 현재 기능이 아니며 앞으로도 최종 확인은 사용자가 직접 해야 한다.</w:t>
+              <w:t>3. 인공지능에 적용하는 방식 (이태규)</w:t>
+            </w:r>
+          </w:p>
+          <w:p>
+            <w:pPr>
+              <w:spacing w:after="0"/>
+              <w:jc w:val="left"/>
+            </w:pPr>
+            <w:r>
+              <w:rPr>
+                <w:b w:val="0"/>
+                <w:sz w:val="18"/>
+              </w:rPr>
+              <w:t>사용자에게 피해 날짜, 금액, 거래 방식, 신고 여부 등을 차례로 질문 -&gt; 사건 카드로 정리</w:t>
+            </w:r>
+          </w:p>
+          <w:p>
+            <w:pPr>
+              <w:spacing w:after="0"/>
+              <w:jc w:val="left"/>
+            </w:pPr>
+            <w:r>
+              <w:rPr>
+                <w:b w:val="0"/>
+                <w:sz w:val="18"/>
+              </w:rPr>
+              <w:t>사건 카드 내용을 바탕으로 비슷한 사례와 현재 단계에서 필요한 절차를 찾아서 보여주는 방식</w:t>
+            </w:r>
+          </w:p>
+          <w:p>
+            <w:pPr>
+              <w:spacing w:after="0"/>
+              <w:jc w:val="left"/>
+            </w:pPr>
+            <w:r>
+              <w:rPr>
+                <w:b w:val="0"/>
+                <w:sz w:val="18"/>
+              </w:rPr>
+              <w:t>증거 자료를 올리면 이체 내역, 대화 내용, 거래 정보 등을 정리하고 빠진 자료가 무엇인지 안내</w:t>
+            </w:r>
+          </w:p>
+          <w:p>
+            <w:pPr>
+              <w:spacing w:after="0"/>
+              <w:jc w:val="left"/>
+            </w:pPr>
+            <w:r>
+              <w:rPr>
+                <w:b w:val="0"/>
+                <w:sz w:val="18"/>
+              </w:rPr>
+              <w:t>별도 프로그램을 새로 만들기보다는 기존 인공지능에 연결해서 쓰는 확장 기능부터 제작</w:t>
+            </w:r>
+          </w:p>
+          <w:p>
+            <w:pPr>
+              <w:spacing w:after="0"/>
+              <w:jc w:val="left"/>
+            </w:pPr>
+            <w:r>
+              <w:rPr>
+                <w:b w:val="0"/>
+                <w:sz w:val="18"/>
+              </w:rPr>
+              <w:t>로그인, 신고서 제출, 소송 서류 최종 제출, 결제는 자동으로 하지 않고 사용자가 마지막에 직접 확인</w:t>
             </w:r>
           </w:p>
           <w:p>
@@ -386,33 +477,124 @@
                 <w:b/>
                 <w:sz w:val="18"/>
               </w:rPr>
-              <w:t>향후 개발 방향</w:t>
-            </w:r>
-          </w:p>
-          <w:p>
-            <w:pPr>
-              <w:spacing w:after="0"/>
-              <w:jc w:val="left"/>
-            </w:pPr>
-            <w:r>
-              <w:rPr>
-                <w:b w:val="0"/>
-                <w:sz w:val="18"/>
-              </w:rPr>
-              <w:t>우선 자료마다 출처, 상태, 확인 범위를 일관되게 기록하는 Wiki 구조를 안정화하고, PDF와 Markdown을 넣었을 때 초안과 검증 목록이 자동으로 만들어지는 흐름을 다듬을 필요가 있다. 그다음 사용자의 사건 날짜, 금액, 거래 방식, 이미 진행한 신고 등을 짧게 확인한 뒤 상태가 맞는 Wiki 문서만 찾아주는 검색 연결부를 단계적으로 구현하는 방향이 적절하다.</w:t>
-            </w:r>
-          </w:p>
-          <w:p>
-            <w:pPr>
-              <w:spacing w:after="0"/>
-              <w:jc w:val="left"/>
-            </w:pPr>
-            <w:r>
-              <w:rPr>
-                <w:b w:val="0"/>
-                <w:sz w:val="18"/>
-              </w:rPr>
-              <w:t>검색 결과에는 유사 사례뿐 아니라 원문 링크, 확인된 범위, 아직 모르는 점을 함께 제시해야 한다. 기술 설명은 비전공자도 이해할 수 있는 쉬운 버전과 실제 구현을 확인할 수 있는 기술 문서를 나누어 제공하고, 개인정보 마스킹과 사용자의 최종 검토 절차를 유지한 상태에서 작은 기능부터 실행해 보는 것이 이후 개발의 주요 과제로 정리된다.</w:t>
+              <w:t>4. 질문 및 의견</w:t>
+            </w:r>
+          </w:p>
+          <w:p>
+            <w:pPr>
+              <w:spacing w:after="0"/>
+              <w:jc w:val="left"/>
+            </w:pPr>
+            <w:r>
+              <w:rPr>
+                <w:b w:val="0"/>
+                <w:sz w:val="18"/>
+              </w:rPr>
+              <w:t>조세영: 피해자가 서비스를 처음 켰을 때 증거 수집과 전체 절차 중 무엇을 먼저 보여주는 게 좋을지?</w:t>
+            </w:r>
+          </w:p>
+          <w:p>
+            <w:pPr>
+              <w:spacing w:after="0"/>
+              <w:jc w:val="left"/>
+            </w:pPr>
+            <w:r>
+              <w:rPr>
+                <w:b w:val="0"/>
+                <w:sz w:val="18"/>
+              </w:rPr>
+              <w:t>정가현: 같은 사건이라도 형사 절차와 민사 절차의 진행 정도가 다른데 화면에서 어떻게 나누어 보여줄지?</w:t>
+            </w:r>
+          </w:p>
+          <w:p>
+            <w:pPr>
+              <w:spacing w:after="0"/>
+              <w:jc w:val="left"/>
+            </w:pPr>
+            <w:r>
+              <w:rPr>
+                <w:b w:val="0"/>
+                <w:sz w:val="18"/>
+              </w:rPr>
+              <w:t>김민정: 그냥 인공지능에 질문하는 것과 사례 자료를 붙여 사용하는 방식은 어떤 차이가 있는지? 어려운 법률 용어를 얼마나 쉽게 풀어줄 수 있는지?</w:t>
+            </w:r>
+          </w:p>
+          <w:p>
+            <w:pPr>
+              <w:spacing w:after="0"/>
+              <w:jc w:val="left"/>
+            </w:pPr>
+            <w:r>
+              <w:rPr>
+                <w:b w:val="0"/>
+                <w:sz w:val="18"/>
+              </w:rPr>
+              <w:t>-&gt; 처음에는 증거 수집 목록과 현재 단계부터 보여주고, 이후 비슷한 사례와 다음 절차를 이어서 설명하는 방향</w:t>
+            </w:r>
+          </w:p>
+          <w:p>
+            <w:pPr>
+              <w:spacing w:after="0"/>
+              <w:jc w:val="left"/>
+            </w:pPr>
+            <w:r>
+              <w:rPr>
+                <w:b/>
+                <w:sz w:val="18"/>
+              </w:rPr>
+              <w:t>5. 다음 작업</w:t>
+            </w:r>
+          </w:p>
+          <w:p>
+            <w:pPr>
+              <w:spacing w:after="0"/>
+              <w:jc w:val="left"/>
+            </w:pPr>
+            <w:r>
+              <w:rPr>
+                <w:b w:val="0"/>
+                <w:sz w:val="18"/>
+              </w:rPr>
+              <w:t>사례 자료를 넣고 필요한 내용을 찾아보는 기본 기능부터 먼저 테스트</w:t>
+            </w:r>
+          </w:p>
+          <w:p>
+            <w:pPr>
+              <w:spacing w:after="0"/>
+              <w:jc w:val="left"/>
+            </w:pPr>
+            <w:r>
+              <w:rPr>
+                <w:b w:val="0"/>
+                <w:sz w:val="18"/>
+              </w:rPr>
+              <w:t>비전공자도 이해할 수 있도록 쉬운 설명 버전 계속 작성</w:t>
+            </w:r>
+          </w:p>
+          <w:p>
+            <w:pPr>
+              <w:spacing w:after="0"/>
+              <w:jc w:val="left"/>
+            </w:pPr>
+            <w:r>
+              <w:rPr>
+                <w:b w:val="0"/>
+                <w:sz w:val="18"/>
+              </w:rPr>
+              <w:t>실제 소액 사기 질문을 몇 가지 넣어 비슷한 사례와 절차가 제대로 나오는지 확인</w:t>
+            </w:r>
+          </w:p>
+          <w:p>
+            <w:pPr>
+              <w:spacing w:after="0"/>
+              <w:jc w:val="left"/>
+            </w:pPr>
+            <w:r>
+              <w:rPr>
+                <w:b w:val="0"/>
+                <w:sz w:val="18"/>
+              </w:rPr>
+              <w:t>작동이 확인되면 사건 진행표나 증거 관리 화면 등 추가 기능 검토</w:t>
             </w:r>
           </w:p>
         </w:tc>
@@ -503,7 +685,7 @@
               <w:rPr>
                 <w:sz w:val="18"/>
               </w:rPr>
-              <w:t>이번에는 별도 회의 대신 공유된 LLM Wiki 보고서를 읽으며 소액 사기 사례를 AI가 활용할 수 있는 자료로 정리하는 방식을 살펴보았다. 같은 사건이라도 신고, 기소, 판결, 집행과 실제 피해금 회수는 서로 다른 단계이므로 확인된 범위를 구분해 기록해야 한다는 점이 중요하게 느껴졌다. 개인 경험이나 보도 자료도 절차를 이해하는 데 도움이 되지만 공식 판결과 같은 근거로 사용해서는 안 된다는 점을 서비스 설명에 분명히 반영해야 할 것 같다. 앞으로는 비전공자도 자료의 상태와 출처를 쉽게 이해할 수 있도록 표현을 다듬고, 실제 사용자가 어떤 설명에서 혼란을 느끼는지 확인해보고 싶다.</w:t>
+              <w:t>이번 회의에서는 소액 사기 사례를 모은 이유와 자료 정리 방식, 실제 인공지능에 적용하는 흐름을 차례로 들어보았다. 저는 피해자가 서비스를 처음 이용할 때 전체 소송 절차보다 증거 수집 목록을 먼저 보여주는 것이 더 실용적이지 않을까 질문했다. 아무리 많은 사례가 정리되어 있어도 사용자가 당장 무엇을 해야 하는지 알기 어렵다면 활용하기 힘들 것 같다. 앞으로는 처음 화면에서 해야 할 일과 이후 절차를 자연스럽게 이어주는 방식으로 서비스를 만들어 나가고 싶다.</w:t>
             </w:r>
           </w:p>
         </w:tc>
@@ -567,7 +749,7 @@
               <w:rPr>
                 <w:sz w:val="18"/>
               </w:rPr>
-              <w:t>공유된 기술 보고서를 통해 40건의 사례를 고정 ID와 출처, 절차 상태가 있는 Markdown Wiki로 정리한 방식과 현재 구현 범위를 검토했습니다. 현재 사건 관리와 자료 intake는 가능하지만 Wiki 자동 검색, 의미 검색, 사건과 주장 연결은 아직 없으므로 문서가 존재하는 것과 에이전트가 이를 활용하는 것을 구분해야 합니다. 향후에는 사용자의 사건 정보를 최소한으로 구조화한 뒤 상태가 맞는 문서만 찾는 검색 MCP를 먼저 구현하고, 결과에 근거 링크와 불확실성을 함께 반환하는 방식으로 발전시키는 것이 적절하다고 생각했습니다. 기능을 과장하기보다 작은 검색 흐름을 실제로 실행하고 검증하면서 범위를 넓혀가야겠습니다.</w:t>
+              <w:t>이번 소모임에서는 정리된 사례 자료를 실제 인공지능이 어떻게 활용할 수 있는지 설명했습니다. 사용자에게 피해 날짜와 금액, 거래 방식, 신고 여부를 차례로 질문해 사건 카드로 만들고, 그 내용과 비슷한 사례를 찾아 다음 절차를 보여주는 흐름입니다. 처음부터 별도 프로그램과 복잡한 화면을 만들기보다 기존 인공지능에 연결하는 작은 기능부터 작동시켜보는 것이 현실적이라고 생각했습니다. 다음에는 실제 소액 사기 질문을 넣어 사례 검색과 절차 안내가 제대로 이어지는지 확인해보고자 합니다.</w:t>
             </w:r>
           </w:p>
         </w:tc>
@@ -632,7 +814,7 @@
               <w:rPr>
                 <w:sz w:val="18"/>
               </w:rPr>
-              <w:t>이번 차시에는 LLM Wiki 사례 확장 보고서를 바탕으로, 법률 자료를 인공지능이 활용할 수 있는 지식 구조로 전환하는 방식을 살펴보았다. 단순히 사례를 많이 모으는 것이 아니라 각 자료의 출처와 확인 범위, 절차 상태를 구분하고 서로 연결하는 과정이 핵심이라는 점이 인상적이었다. 특히 개인의 경험과 공식 판결을 동일한 수준으로 다루지 않고, 판결·집행·실제 회수 여부를 별개의 사실로 남기는 방식은 법률 정보의 신뢰성을 위해 반드시 필요해 보였다. 추후에는 이러한 구조가 실제 질문에 맞는 사례를 찾아주는 검색 기능과 결합될 때 어떤 한계가 발생하는지 검토하고 싶다.</w:t>
+              <w:t>이번 차시에서는 사례를 수집한 이유와 자료를 정리하는 방식, 이를 인공지능에 적용하는 과정에 대한 발표를 들었다. 같은 사건이라도 형사 절차와 민사 절차가 서로 다른 속도로 진행될 수 있는데, 사용자의 현재 위치를 화면에서 어떻게 나누어 보여줄 것인지 질문하였다. 단순히 비슷한 사건을 제시하는 것보다 신고, 재판, 배상명령, 민사 소송 중 어느 단계에 해당하는지를 함께 보여주어야 실제 도움이 될 것 같다. 추후 사건 진행표가 이러한 복잡한 절차를 얼마나 직관적으로 보여줄 수 있을지 살펴보고 싶다.</w:t>
             </w:r>
           </w:p>
         </w:tc>
@@ -684,7 +866,7 @@
               <w:rPr>
                 <w:sz w:val="18"/>
               </w:rPr>
-              <w:t>LLM Wiki라고 해서 새로운 AI 모델을 만드는 것인 줄 알았는데, 자료를 AI가 찾기 쉽게 제목과 출처, 상태별로 정리해 둔 문서 모음에 더 가깝다는 점을 알게 되었다. 특히 지금 만들어진 기능과 앞으로 만들 기능을 나누어 적어 둔 부분이 좋았다. 문서가 정리되어 있다고 해서 AI가 자동으로 검색하거나 소송을 대신해 주는 것은 아니기 때문이다. 앞으로는 어려운 기술 용어를 쉬운 설명과 함께 보여주고, 사용자가 보고 있는 사례가 공식 자료인지 개인 경험인지 바로 알 수 있게 만들면 좋을 것 같다. 실제 기능도 한꺼번에 많이 추가하기보다 자료를 넣고 검색하는 과정부터 차근차근 확인해보고 싶다.</w:t>
+              <w:t>이번에는 사례를 모으고 정리한 방식과 그 자료를 인공지능에 붙여 쓰는 방법에 대한 발표를 들었다. 그냥 인공지능에 질문하는 것과 우리가 정리한 사례를 함께 사용하는 것이 어떻게 다른지 궁금했는데, 필요한 사례를 먼저 찾아보고 답한다는 점에서 차이가 있다는 설명을 들었다. 다만 법률 용어가 어려우면 좋은 자료가 있어도 일반 사용자는 이해하기 힘들 것 같다. 처음 보는 사람도 따라갈 수 있도록 짧고 쉬운 설명을 많이 넣으면 좋겠다는 의견을 냈다.</w:t>
             </w:r>
           </w:p>
         </w:tc>
@@ -749,7 +931,7 @@
               <w:rPr>
                 <w:sz w:val="18"/>
               </w:rPr>
-              <w:t>추가 조사한 사례를 LLM Wiki 방식으로 정리한 보고서를 공유하고, 현재 구현된 자료 수집 및 관리 구조와 이후 개발 방향을 검토했습니다. 사례별 고정 ID, 출처, 상태, 주장 연결을 Markdown으로 관리하면 인공지능이 필요한 자료를 선택하기 쉽고 수정 이력도 추적할 수 있다는 장점이 있습니다. 반면 현재는 Wiki 검색과 의미 기반 탐색이 구현되지 않았기에, 향후 개발에서는 자료 입력과 검증 흐름을 먼저 안정화한 뒤 검색 MCP를 연결하는 순서가 적절합니다. 공식 자료와 개인 경험의 증거 수준을 구분하는 기준을 유지하면서 실제 에이전트가 참고할 수 있는 지식 기반으로 발전시킬 필요성을 느꼈습니다.</w:t>
+              <w:t>추가로 모은 소액 사기 사례를 인공지능이 읽기 쉬운 자료로 정리하는 방식을 발표했습니다. 사례마다 번호를 붙이고 사건 내용, 사기 방식, 진행 과정, 참고 링크를 같은 순서로 작성하면 새로운 자료를 추가하거나 수정하기가 쉬워집니다. 또한 긴 원문 전체를 매번 사용하는 대신 질문과 관련된 사례만 골라 볼 수 있어 비용과 시간을 줄일 수 있습니다. 앞으로는 자료 형식을 통일하고 실제 질문에서 필요한 사례를 제대로 찾는지 확인해야 합니다.</w:t>
             </w:r>
           </w:p>
         </w:tc>
@@ -814,7 +996,7 @@
               <w:rPr>
                 <w:sz w:val="18"/>
               </w:rPr>
-              <w:t>공유된 보고서를 읽으며 법률 사례를 정리할 때 자료의 출처와 확인 상태를 함께 기록하는 것이 왜 중요한지 이해할 수 있었다. 특히 신고나 기소 사실만 확인된 사건을 판결이나 피해 회수가 끝난 사례처럼 표현하지 않고, 각 절차를 분리해 표시하는 방식이 인상 깊었다. 개인정보가 포함된 원본은 가능한 한 로컬에 두고 외부 모델에는 가린 요약만 전달하며, 생성된 초안도 원문 대조와 검증을 거쳐야 한다는 원칙이 서비스의 신뢰성과 직결된다고 생각한다. 앞으로 검색 기능을 추가하더라도 근거의 한계와 아직 확인되지 않은 점을 사용자에게 함께 알리는 구조가 유지되어야 할 것이다.</w:t>
+              <w:t>소액 사기 사례를 왜 여러 유형으로 모았는지 발표하면서, 같은 소액 사기라도 피해 방식과 이후 절차가 매우 다르다는 점을 다시 확인할 수 있었다. 중고거래, 공동구매, 게임 계정 등 사기 수법이 다양하고, 신고에서 끝난 사건과 재판이나 민사 소송까지 이어진 사건도 구분할 필요가 있었다. 피해자가 자신의 상황과 비슷한 사례를 통해 필요한 증거와 다음 절차를 이해할 수 있도록 돕는 것이 사례 수집의 가장 중요한 목적이라고 생각한다. 앞으로는 빠진 피해 유형이나 절차가 없는지 더 살펴보고 싶다.</w:t>
             </w:r>
           </w:p>
         </w:tc>

</xml_diff>